<commit_message>
Remove numero da identificacao do servico Tablet
</commit_message>
<xml_diff>
--- a/documentações/Processos/docx/processo_entrega_garantia_devolucao_tablets_glpi.docx
+++ b/documentações/Processos/docx/processo_entrega_garantia_devolucao_tablets_glpi.docx
@@ -123,10 +123,7 @@
           </w:tcPr>
           <w:p>
             <w:r>
-              <w:rPr>
-                <w:sz w:val="16"/>
-              </w:rPr>
-              <w:t>5. TABLET</w:t>
+              <w:t>TABLET</w:t>
             </w:r>
           </w:p>
         </w:tc>

</xml_diff>

<commit_message>
Remove numero do Tablet em todo o processo
</commit_message>
<xml_diff>
--- a/documentações/Processos/docx/processo_entrega_garantia_devolucao_tablets_glpi.docx
+++ b/documentações/Processos/docx/processo_entrega_garantia_devolucao_tablets_glpi.docx
@@ -725,7 +725,7 @@
         <w:pStyle w:val="IntenseQuote"/>
       </w:pPr>
       <w:r>
-        <w:t>Categorização obrigatória: para qualquer fluxo abaixo, a categoria do GLPI deve seguir o serviço 5. TABLET e a solicitação exata do catálogo administrativo.</w:t>
+        <w:t>Categorização obrigatória: para qualquer fluxo abaixo, a categoria do GLPI deve seguir o serviço TABLET e a solicitação exata do catálogo administrativo.</w:t>
       </w:r>
     </w:p>
     <w:p>
@@ -915,7 +915,7 @@
               <w:rPr>
                 <w:sz w:val="16"/>
               </w:rPr>
-              <w:t>Categorizar como 5. TABLET &gt; CONFIGURAÇÃO.</w:t>
+              <w:t>Categorizar como TABLET &gt; CONFIGURAÇÃO.</w:t>
             </w:r>
           </w:p>
         </w:tc>
@@ -1253,7 +1253,7 @@
               <w:rPr>
                 <w:sz w:val="16"/>
               </w:rPr>
-              <w:t>Abrir e categorizar o chamado como 5. TABLET &gt; DEVOLUÇÃO.</w:t>
+              <w:t>Abrir e categorizar o chamado como TABLET &gt; DEVOLUÇÃO.</w:t>
             </w:r>
           </w:p>
         </w:tc>
@@ -1591,7 +1591,7 @@
               <w:rPr>
                 <w:sz w:val="16"/>
               </w:rPr>
-              <w:t>Abrir e categorizar o chamado como 5. TABLET &gt; EMPRÉSTIMO.</w:t>
+              <w:t>Abrir e categorizar o chamado como TABLET &gt; EMPRÉSTIMO.</w:t>
             </w:r>
           </w:p>
         </w:tc>
@@ -1937,7 +1937,7 @@
               <w:rPr>
                 <w:sz w:val="16"/>
               </w:rPr>
-              <w:t>Abrir e categorizar o chamado como 5. TABLET &gt; ENTREGA.</w:t>
+              <w:t>Abrir e categorizar o chamado como TABLET &gt; ENTREGA.</w:t>
             </w:r>
           </w:p>
         </w:tc>
@@ -2341,7 +2341,7 @@
               <w:rPr>
                 <w:sz w:val="16"/>
               </w:rPr>
-              <w:t>Categorizar como 5. TABLET &gt; MANUTENÇÃO CORRETIVA.</w:t>
+              <w:t>Categorizar como TABLET &gt; MANUTENÇÃO CORRETIVA.</w:t>
             </w:r>
           </w:p>
         </w:tc>
@@ -2911,7 +2911,7 @@
               <w:rPr>
                 <w:sz w:val="16"/>
               </w:rPr>
-              <w:t>Categorizar como 5. TABLET &gt; FURTO/ROUBO/PERDA.</w:t>
+              <w:t>Categorizar como TABLET &gt; FURTO/ROUBO/PERDA.</w:t>
             </w:r>
           </w:p>
         </w:tc>

</xml_diff>